<commit_message>
Corrección de los manuales
</commit_message>
<xml_diff>
--- a/documentacion/entregables/Manual_Tecnico_MetaFit.docx
+++ b/documentacion/entregables/Manual_Tecnico_MetaFit.docx
@@ -466,6 +466,510 @@
           </w:p>
         </w:tc>
       </w:tr>
+      <w:tr>
+        <w:tc>
+          <w:tcPr>
+            <w:tcW w:type="dxa" w:w="4320"/>
+          </w:tcPr>
+          <w:p>
+            <w:pPr>
+              <w:spacing w:before="0" w:after="40" w:line="240" w:lineRule="auto"/>
+              <w:ind w:firstLine="0"/>
+            </w:pPr>
+            <w:r/>
+            <w:r>
+              <w:rPr>
+                <w:rFonts w:ascii="Times New Roman" w:hAnsi="Times New Roman" w:cs="Times New Roman" w:eastAsia="Times New Roman"/>
+                <w:color w:val="000000"/>
+                <w:sz w:val="20"/>
+              </w:rPr>
+              <w:t>Nombre del sistema</w:t>
+            </w:r>
+          </w:p>
+        </w:tc>
+        <w:tc>
+          <w:tcPr>
+            <w:tcW w:type="dxa" w:w="4320"/>
+          </w:tcPr>
+          <w:p>
+            <w:pPr>
+              <w:spacing w:before="0" w:after="40" w:line="240" w:lineRule="auto"/>
+              <w:ind w:firstLine="0"/>
+            </w:pPr>
+            <w:r/>
+            <w:r>
+              <w:rPr>
+                <w:rFonts w:ascii="Times New Roman" w:hAnsi="Times New Roman" w:cs="Times New Roman" w:eastAsia="Times New Roman"/>
+                <w:color w:val="000000"/>
+                <w:sz w:val="20"/>
+              </w:rPr>
+              <w:t>MetaFit — Sistema de Gestión Deportiva</w:t>
+            </w:r>
+          </w:p>
+        </w:tc>
+      </w:tr>
+      <w:tr>
+        <w:tc>
+          <w:tcPr>
+            <w:tcW w:type="dxa" w:w="4320"/>
+          </w:tcPr>
+          <w:p>
+            <w:pPr>
+              <w:spacing w:before="0" w:after="40" w:line="240" w:lineRule="auto"/>
+              <w:ind w:firstLine="0"/>
+            </w:pPr>
+            <w:r/>
+            <w:r>
+              <w:rPr>
+                <w:rFonts w:ascii="Times New Roman" w:hAnsi="Times New Roman" w:cs="Times New Roman" w:eastAsia="Times New Roman"/>
+                <w:color w:val="000000"/>
+                <w:sz w:val="20"/>
+              </w:rPr>
+              <w:t>Sigla</w:t>
+            </w:r>
+          </w:p>
+        </w:tc>
+        <w:tc>
+          <w:tcPr>
+            <w:tcW w:type="dxa" w:w="4320"/>
+          </w:tcPr>
+          <w:p>
+            <w:pPr>
+              <w:spacing w:before="0" w:after="40" w:line="240" w:lineRule="auto"/>
+              <w:ind w:firstLine="0"/>
+            </w:pPr>
+            <w:r/>
+            <w:r>
+              <w:rPr>
+                <w:rFonts w:ascii="Times New Roman" w:hAnsi="Times New Roman" w:cs="Times New Roman" w:eastAsia="Times New Roman"/>
+                <w:color w:val="000000"/>
+                <w:sz w:val="20"/>
+              </w:rPr>
+              <w:t>MFT</w:t>
+            </w:r>
+          </w:p>
+        </w:tc>
+      </w:tr>
+      <w:tr>
+        <w:tc>
+          <w:tcPr>
+            <w:tcW w:type="dxa" w:w="4320"/>
+          </w:tcPr>
+          <w:p>
+            <w:pPr>
+              <w:spacing w:before="0" w:after="40" w:line="240" w:lineRule="auto"/>
+              <w:ind w:firstLine="0"/>
+            </w:pPr>
+            <w:r/>
+            <w:r>
+              <w:rPr>
+                <w:rFonts w:ascii="Times New Roman" w:hAnsi="Times New Roman" w:cs="Times New Roman" w:eastAsia="Times New Roman"/>
+                <w:color w:val="000000"/>
+                <w:sz w:val="20"/>
+              </w:rPr>
+              <w:t>Descripción del sistema</w:t>
+            </w:r>
+          </w:p>
+        </w:tc>
+        <w:tc>
+          <w:tcPr>
+            <w:tcW w:type="dxa" w:w="4320"/>
+          </w:tcPr>
+          <w:p>
+            <w:pPr>
+              <w:spacing w:before="0" w:after="40" w:line="240" w:lineRule="auto"/>
+              <w:ind w:firstLine="0"/>
+            </w:pPr>
+            <w:r/>
+            <w:r>
+              <w:rPr>
+                <w:rFonts w:ascii="Times New Roman" w:hAnsi="Times New Roman" w:cs="Times New Roman" w:eastAsia="Times New Roman"/>
+                <w:color w:val="000000"/>
+                <w:sz w:val="20"/>
+              </w:rPr>
+              <w:t>Solución de software para la gestión integral de gimnasios: registro y control de afiliados, asignación de planes de entrenamiento y nutrición, seguimiento de progreso, control de pagos y notificaciones, con panel web y aplicación móvil.</w:t>
+            </w:r>
+          </w:p>
+        </w:tc>
+      </w:tr>
+      <w:tr>
+        <w:tc>
+          <w:tcPr>
+            <w:tcW w:type="dxa" w:w="4320"/>
+          </w:tcPr>
+          <w:p>
+            <w:pPr>
+              <w:spacing w:before="0" w:after="40" w:line="240" w:lineRule="auto"/>
+              <w:ind w:firstLine="0"/>
+            </w:pPr>
+            <w:r/>
+            <w:r>
+              <w:rPr>
+                <w:rFonts w:ascii="Times New Roman" w:hAnsi="Times New Roman" w:cs="Times New Roman" w:eastAsia="Times New Roman"/>
+                <w:color w:val="000000"/>
+                <w:sz w:val="20"/>
+              </w:rPr>
+              <w:t>Versión del sistema</w:t>
+            </w:r>
+          </w:p>
+        </w:tc>
+        <w:tc>
+          <w:tcPr>
+            <w:tcW w:type="dxa" w:w="4320"/>
+          </w:tcPr>
+          <w:p>
+            <w:pPr>
+              <w:spacing w:before="0" w:after="40" w:line="240" w:lineRule="auto"/>
+              <w:ind w:firstLine="0"/>
+            </w:pPr>
+            <w:r/>
+            <w:r>
+              <w:rPr>
+                <w:rFonts w:ascii="Times New Roman" w:hAnsi="Times New Roman" w:cs="Times New Roman" w:eastAsia="Times New Roman"/>
+                <w:color w:val="000000"/>
+                <w:sz w:val="20"/>
+              </w:rPr>
+              <w:t>1.0.0</w:t>
+            </w:r>
+          </w:p>
+        </w:tc>
+      </w:tr>
+      <w:tr>
+        <w:tc>
+          <w:tcPr>
+            <w:tcW w:type="dxa" w:w="4320"/>
+          </w:tcPr>
+          <w:p>
+            <w:pPr>
+              <w:spacing w:before="0" w:after="40" w:line="240" w:lineRule="auto"/>
+              <w:ind w:firstLine="0"/>
+            </w:pPr>
+            <w:r/>
+            <w:r>
+              <w:rPr>
+                <w:rFonts w:ascii="Times New Roman" w:hAnsi="Times New Roman" w:cs="Times New Roman" w:eastAsia="Times New Roman"/>
+                <w:color w:val="000000"/>
+                <w:sz w:val="20"/>
+              </w:rPr>
+              <w:t>Categoría (MRE)</w:t>
+            </w:r>
+          </w:p>
+        </w:tc>
+        <w:tc>
+          <w:tcPr>
+            <w:tcW w:type="dxa" w:w="4320"/>
+          </w:tcPr>
+          <w:p>
+            <w:pPr>
+              <w:spacing w:before="0" w:after="40" w:line="240" w:lineRule="auto"/>
+              <w:ind w:firstLine="0"/>
+            </w:pPr>
+            <w:r/>
+            <w:r>
+              <w:rPr>
+                <w:rFonts w:ascii="Times New Roman" w:hAnsi="Times New Roman" w:cs="Times New Roman" w:eastAsia="Times New Roman"/>
+                <w:color w:val="000000"/>
+                <w:sz w:val="20"/>
+              </w:rPr>
+              <w:t>Sistema misional</w:t>
+            </w:r>
+          </w:p>
+        </w:tc>
+      </w:tr>
+      <w:tr>
+        <w:tc>
+          <w:tcPr>
+            <w:tcW w:type="dxa" w:w="4320"/>
+          </w:tcPr>
+          <w:p>
+            <w:pPr>
+              <w:spacing w:before="0" w:after="40" w:line="240" w:lineRule="auto"/>
+              <w:ind w:firstLine="0"/>
+            </w:pPr>
+            <w:r/>
+            <w:r>
+              <w:rPr>
+                <w:rFonts w:ascii="Times New Roman" w:hAnsi="Times New Roman" w:cs="Times New Roman" w:eastAsia="Times New Roman"/>
+                <w:color w:val="000000"/>
+                <w:sz w:val="20"/>
+              </w:rPr>
+              <w:t>Fabricante</w:t>
+            </w:r>
+          </w:p>
+        </w:tc>
+        <w:tc>
+          <w:tcPr>
+            <w:tcW w:type="dxa" w:w="4320"/>
+          </w:tcPr>
+          <w:p>
+            <w:pPr>
+              <w:spacing w:before="0" w:after="40" w:line="240" w:lineRule="auto"/>
+              <w:ind w:firstLine="0"/>
+            </w:pPr>
+            <w:r/>
+            <w:r>
+              <w:rPr>
+                <w:rFonts w:ascii="Times New Roman" w:hAnsi="Times New Roman" w:cs="Times New Roman" w:eastAsia="Times New Roman"/>
+                <w:color w:val="000000"/>
+                <w:sz w:val="20"/>
+              </w:rPr>
+              <w:t>MetaFit Inc. (equipo de desarrollo SENA, Ficha 3278645)</w:t>
+            </w:r>
+          </w:p>
+        </w:tc>
+      </w:tr>
+      <w:tr>
+        <w:tc>
+          <w:tcPr>
+            <w:tcW w:type="dxa" w:w="4320"/>
+          </w:tcPr>
+          <w:p>
+            <w:pPr>
+              <w:spacing w:before="0" w:after="40" w:line="240" w:lineRule="auto"/>
+              <w:ind w:firstLine="0"/>
+            </w:pPr>
+            <w:r/>
+            <w:r>
+              <w:rPr>
+                <w:rFonts w:ascii="Times New Roman" w:hAnsi="Times New Roman" w:cs="Times New Roman" w:eastAsia="Times New Roman"/>
+                <w:color w:val="000000"/>
+                <w:sz w:val="20"/>
+              </w:rPr>
+              <w:t>Fecha de vencimiento del soporte</w:t>
+            </w:r>
+          </w:p>
+        </w:tc>
+        <w:tc>
+          <w:tcPr>
+            <w:tcW w:type="dxa" w:w="4320"/>
+          </w:tcPr>
+          <w:p>
+            <w:pPr>
+              <w:spacing w:before="0" w:after="40" w:line="240" w:lineRule="auto"/>
+              <w:ind w:firstLine="0"/>
+            </w:pPr>
+            <w:r/>
+            <w:r>
+              <w:rPr>
+                <w:rFonts w:ascii="Times New Roman" w:hAnsi="Times New Roman" w:cs="Times New Roman" w:eastAsia="Times New Roman"/>
+                <w:color w:val="000000"/>
+                <w:sz w:val="20"/>
+              </w:rPr>
+              <w:t>30 de junio de 2027 (soporte previsto por 12 meses)</w:t>
+            </w:r>
+          </w:p>
+        </w:tc>
+      </w:tr>
+      <w:tr>
+        <w:tc>
+          <w:tcPr>
+            <w:tcW w:type="dxa" w:w="4320"/>
+          </w:tcPr>
+          <w:p>
+            <w:pPr>
+              <w:spacing w:before="0" w:after="40" w:line="240" w:lineRule="auto"/>
+              <w:ind w:firstLine="0"/>
+            </w:pPr>
+            <w:r/>
+            <w:r>
+              <w:rPr>
+                <w:rFonts w:ascii="Times New Roman" w:hAnsi="Times New Roman" w:cs="Times New Roman" w:eastAsia="Times New Roman"/>
+                <w:color w:val="000000"/>
+                <w:sz w:val="20"/>
+              </w:rPr>
+              <w:t>Sistema operativo</w:t>
+            </w:r>
+          </w:p>
+        </w:tc>
+        <w:tc>
+          <w:tcPr>
+            <w:tcW w:type="dxa" w:w="4320"/>
+          </w:tcPr>
+          <w:p>
+            <w:pPr>
+              <w:spacing w:before="0" w:after="40" w:line="240" w:lineRule="auto"/>
+              <w:ind w:firstLine="0"/>
+            </w:pPr>
+            <w:r/>
+            <w:r>
+              <w:rPr>
+                <w:rFonts w:ascii="Times New Roman" w:hAnsi="Times New Roman" w:cs="Times New Roman" w:eastAsia="Times New Roman"/>
+                <w:color w:val="000000"/>
+                <w:sz w:val="20"/>
+              </w:rPr>
+              <w:t>Servidor: Linux (Debian 12, contenedor Docker). Clientes: Windows 11, macOS, Linux y Android 12 o superior</w:t>
+            </w:r>
+          </w:p>
+        </w:tc>
+      </w:tr>
+      <w:tr>
+        <w:tc>
+          <w:tcPr>
+            <w:tcW w:type="dxa" w:w="4320"/>
+          </w:tcPr>
+          <w:p>
+            <w:pPr>
+              <w:spacing w:before="0" w:after="40" w:line="240" w:lineRule="auto"/>
+              <w:ind w:firstLine="0"/>
+            </w:pPr>
+            <w:r/>
+            <w:r>
+              <w:rPr>
+                <w:rFonts w:ascii="Times New Roman" w:hAnsi="Times New Roman" w:cs="Times New Roman" w:eastAsia="Times New Roman"/>
+                <w:color w:val="000000"/>
+                <w:sz w:val="20"/>
+              </w:rPr>
+              <w:t>Lenguaje de programación</w:t>
+            </w:r>
+          </w:p>
+        </w:tc>
+        <w:tc>
+          <w:tcPr>
+            <w:tcW w:type="dxa" w:w="4320"/>
+          </w:tcPr>
+          <w:p>
+            <w:pPr>
+              <w:spacing w:before="0" w:after="40" w:line="240" w:lineRule="auto"/>
+              <w:ind w:firstLine="0"/>
+            </w:pPr>
+            <w:r/>
+            <w:r>
+              <w:rPr>
+                <w:rFonts w:ascii="Times New Roman" w:hAnsi="Times New Roman" w:cs="Times New Roman" w:eastAsia="Times New Roman"/>
+                <w:color w:val="000000"/>
+                <w:sz w:val="20"/>
+              </w:rPr>
+              <w:t>JavaScript / Node.js 22 (backend), React 19 (web), React Native 0.83 + Expo SDK 55 (móvil) y SQL</w:t>
+            </w:r>
+          </w:p>
+        </w:tc>
+      </w:tr>
+      <w:tr>
+        <w:tc>
+          <w:tcPr>
+            <w:tcW w:type="dxa" w:w="4320"/>
+          </w:tcPr>
+          <w:p>
+            <w:pPr>
+              <w:spacing w:before="0" w:after="40" w:line="240" w:lineRule="auto"/>
+              <w:ind w:firstLine="0"/>
+            </w:pPr>
+            <w:r/>
+            <w:r>
+              <w:rPr>
+                <w:rFonts w:ascii="Times New Roman" w:hAnsi="Times New Roman" w:cs="Times New Roman" w:eastAsia="Times New Roman"/>
+                <w:color w:val="000000"/>
+                <w:sz w:val="20"/>
+              </w:rPr>
+              <w:t>Plataforma de base de datos</w:t>
+            </w:r>
+          </w:p>
+        </w:tc>
+        <w:tc>
+          <w:tcPr>
+            <w:tcW w:type="dxa" w:w="4320"/>
+          </w:tcPr>
+          <w:p>
+            <w:pPr>
+              <w:spacing w:before="0" w:after="40" w:line="240" w:lineRule="auto"/>
+              <w:ind w:firstLine="0"/>
+            </w:pPr>
+            <w:r/>
+            <w:r>
+              <w:rPr>
+                <w:rFonts w:ascii="Times New Roman" w:hAnsi="Times New Roman" w:cs="Times New Roman" w:eastAsia="Times New Roman"/>
+                <w:color w:val="000000"/>
+                <w:sz w:val="20"/>
+              </w:rPr>
+              <w:t>MariaDB 11 / MySQL 8.0</w:t>
+            </w:r>
+          </w:p>
+        </w:tc>
+      </w:tr>
+      <w:tr>
+        <w:tc>
+          <w:tcPr>
+            <w:tcW w:type="dxa" w:w="4320"/>
+          </w:tcPr>
+          <w:p>
+            <w:pPr>
+              <w:spacing w:before="0" w:after="40" w:line="240" w:lineRule="auto"/>
+              <w:ind w:firstLine="0"/>
+            </w:pPr>
+            <w:r/>
+            <w:r>
+              <w:rPr>
+                <w:rFonts w:ascii="Times New Roman" w:hAnsi="Times New Roman" w:cs="Times New Roman" w:eastAsia="Times New Roman"/>
+                <w:color w:val="000000"/>
+                <w:sz w:val="20"/>
+              </w:rPr>
+              <w:t>Documentación técnica y funcional</w:t>
+            </w:r>
+          </w:p>
+        </w:tc>
+        <w:tc>
+          <w:tcPr>
+            <w:tcW w:type="dxa" w:w="4320"/>
+          </w:tcPr>
+          <w:p>
+            <w:pPr>
+              <w:spacing w:before="0" w:after="40" w:line="240" w:lineRule="auto"/>
+              <w:ind w:firstLine="0"/>
+            </w:pPr>
+            <w:r/>
+            <w:r>
+              <w:rPr>
+                <w:rFonts w:ascii="Times New Roman" w:hAnsi="Times New Roman" w:cs="Times New Roman" w:eastAsia="Times New Roman"/>
+                <w:color w:val="000000"/>
+                <w:sz w:val="20"/>
+              </w:rPr>
+              <w:t>Manual Técnico, Manual de Usuario, Manual de Instalación, Diccionario de Datos, Modelo Entidad-Relación, diagramas UML y BPMN; API documentada con Swagger/OpenAPI</w:t>
+            </w:r>
+          </w:p>
+        </w:tc>
+      </w:tr>
+      <w:tr>
+        <w:tc>
+          <w:tcPr>
+            <w:tcW w:type="dxa" w:w="4320"/>
+          </w:tcPr>
+          <w:p>
+            <w:pPr>
+              <w:spacing w:before="0" w:after="40" w:line="240" w:lineRule="auto"/>
+              <w:ind w:firstLine="0"/>
+            </w:pPr>
+            <w:r/>
+            <w:r>
+              <w:rPr>
+                <w:rFonts w:ascii="Times New Roman" w:hAnsi="Times New Roman" w:cs="Times New Roman" w:eastAsia="Times New Roman"/>
+                <w:color w:val="000000"/>
+                <w:sz w:val="20"/>
+              </w:rPr>
+              <w:t>Arquitectura tecnológica</w:t>
+            </w:r>
+          </w:p>
+        </w:tc>
+        <w:tc>
+          <w:tcPr>
+            <w:tcW w:type="dxa" w:w="4320"/>
+          </w:tcPr>
+          <w:p>
+            <w:pPr>
+              <w:spacing w:before="0" w:after="40" w:line="240" w:lineRule="auto"/>
+              <w:ind w:firstLine="0"/>
+            </w:pPr>
+            <w:r/>
+            <w:r>
+              <w:rPr>
+                <w:rFonts w:ascii="Times New Roman" w:hAnsi="Times New Roman" w:cs="Times New Roman" w:eastAsia="Times New Roman"/>
+                <w:color w:val="000000"/>
+                <w:sz w:val="20"/>
+              </w:rPr>
+              <w:t>Cliente-servidor en tres capas: presentación (web y móvil), lógica de negocio (API REST en Node.js/Express) y datos (MariaDB 11); desplegada con Docker y CI/CD en Render</w:t>
+            </w:r>
+          </w:p>
+        </w:tc>
+      </w:tr>
     </w:tbl>
     <w:p>
       <w:pPr>
@@ -549,6 +1053,25 @@
           <w:sz w:val="24"/>
         </w:rPr>
         <w:t>Índice</w:t>
+      </w:r>
+    </w:p>
+    <w:p>
+      <w:pPr>
+        <w:spacing w:before="0" w:after="0" w:line="480" w:lineRule="auto"/>
+        <w:ind w:firstLine="0" w:left="0"/>
+        <w:jc w:val="left"/>
+      </w:pPr>
+      <w:r>
+        <w:rPr>
+          <w:rFonts w:ascii="Times New Roman" w:hAnsi="Times New Roman" w:cs="Times New Roman" w:eastAsia="Times New Roman"/>
+          <w:color w:val="000000"/>
+          <w:sz w:val="24"/>
+        </w:rPr>
+        <w:fldChar w:fldCharType="begin"/>
+        <w:instrText xml:space="preserve">TOC \o "1-3" \h \z \u</w:instrText>
+        <w:fldChar w:fldCharType="separate"/>
+        <w:t>Haga clic derecho y seleccione «Actualizar campo» para generar índice.</w:t>
+        <w:fldChar w:fldCharType="end"/>
       </w:r>
     </w:p>
     <w:p>
@@ -26620,6 +27143,140 @@
           <w:sz w:val="24"/>
         </w:rPr>
         <w:t>MetaFit Inc. · Sport Gym Sede 80 · Bogotá, Colombia</w:t>
+      </w:r>
+    </w:p>
+    <w:p>
+      <w:pPr>
+        <w:pStyle w:val="Heading2"/>
+        <w:spacing w:before="0" w:after="0" w:line="480" w:lineRule="auto"/>
+        <w:ind w:firstLine="0" w:left="0"/>
+        <w:jc w:val="left"/>
+      </w:pPr>
+      <w:r>
+        <w:rPr>
+          <w:rFonts w:ascii="Times New Roman" w:hAnsi="Times New Roman" w:cs="Times New Roman" w:eastAsia="Times New Roman"/>
+          <w:b/>
+          <w:i w:val="0"/>
+          <w:color w:val="000000"/>
+          <w:sz w:val="24"/>
+        </w:rPr>
+        <w:t>Categorización del sistema (MRE)</w:t>
+      </w:r>
+    </w:p>
+    <w:p>
+      <w:pPr>
+        <w:spacing w:before="0" w:after="0" w:line="480" w:lineRule="auto"/>
+        <w:ind w:firstLine="720" w:left="0"/>
+        <w:jc w:val="left"/>
+      </w:pPr>
+      <w:r>
+        <w:rPr>
+          <w:rFonts w:ascii="Times New Roman" w:hAnsi="Times New Roman" w:cs="Times New Roman" w:eastAsia="Times New Roman"/>
+          <w:color w:val="000000"/>
+          <w:sz w:val="24"/>
+        </w:rPr>
+        <w:t>Sistema misional. Soporta los procesos misionales del gimnasio: gestión de afiliados, asignación de planes de entrenamiento y nutrición, seguimiento del progreso y control de pagos (Ministerio de Tecnologías de la Información y las Comunicaciones [MinTIC], 2018).</w:t>
+      </w:r>
+    </w:p>
+    <w:p>
+      <w:pPr>
+        <w:spacing w:before="0" w:after="0" w:line="480" w:lineRule="auto"/>
+        <w:ind w:firstLine="720" w:left="0"/>
+        <w:jc w:val="left"/>
+      </w:pPr>
+      <w:r>
+        <w:rPr>
+          <w:rFonts w:ascii="Times New Roman" w:hAnsi="Times New Roman" w:cs="Times New Roman" w:eastAsia="Times New Roman"/>
+          <w:color w:val="000000"/>
+          <w:sz w:val="24"/>
+        </w:rPr>
+        <w:t>De acuerdo con la clasificación del Marco de Referencia de Arquitectura Empresarial para la Gestión de TI en el Estado, los sistemas de información se clasifican en misionales, de apoyo, portales digitales y de direccionamiento estratégico. MetaFit se ubica como sistema misional porque soporta directamente el servicio que presta el gimnasio a sus afiliados.</w:t>
+      </w:r>
+    </w:p>
+    <w:p>
+      <w:pPr>
+        <w:spacing w:line="240" w:lineRule="auto"/>
+      </w:pPr>
+      <w:r>
+        <w:br w:type="page"/>
+      </w:r>
+    </w:p>
+    <w:p>
+      <w:pPr>
+        <w:pStyle w:val="Heading1"/>
+        <w:spacing w:before="0" w:after="0" w:line="480" w:lineRule="auto"/>
+        <w:ind w:firstLine="0" w:left="0"/>
+        <w:jc w:val="center"/>
+      </w:pPr>
+      <w:r>
+        <w:rPr>
+          <w:rFonts w:ascii="Times New Roman" w:hAnsi="Times New Roman" w:cs="Times New Roman" w:eastAsia="Times New Roman"/>
+          <w:b/>
+          <w:i w:val="0"/>
+          <w:color w:val="000000"/>
+          <w:sz w:val="24"/>
+        </w:rPr>
+        <w:t>Referencias</w:t>
+      </w:r>
+    </w:p>
+    <w:p>
+      <w:pPr>
+        <w:spacing w:before="0" w:after="0" w:line="480" w:lineRule="auto"/>
+        <w:ind w:hanging="720" w:left="720"/>
+        <w:jc w:val="left"/>
+      </w:pPr>
+      <w:r>
+        <w:rPr>
+          <w:rFonts w:ascii="Times New Roman" w:hAnsi="Times New Roman" w:cs="Times New Roman" w:eastAsia="Times New Roman"/>
+          <w:color w:val="000000"/>
+          <w:sz w:val="24"/>
+        </w:rPr>
+        <w:t>MetaFit Inc. (2026). Repositorio del proyecto MetaFit [Código fuente y documentación]. https://github.com/juanscarvajal04-droid/Equipo_Metafit</w:t>
+      </w:r>
+    </w:p>
+    <w:p>
+      <w:pPr>
+        <w:spacing w:before="0" w:after="0" w:line="480" w:lineRule="auto"/>
+        <w:ind w:hanging="720" w:left="720"/>
+        <w:jc w:val="left"/>
+      </w:pPr>
+      <w:r>
+        <w:rPr>
+          <w:rFonts w:ascii="Times New Roman" w:hAnsi="Times New Roman" w:cs="Times New Roman" w:eastAsia="Times New Roman"/>
+          <w:color w:val="000000"/>
+          <w:sz w:val="24"/>
+        </w:rPr>
+        <w:t>Microsoft. (2021). Requisitos del sistema de Windows 11. https://www.microsoft.com/windows/windows-11</w:t>
+      </w:r>
+    </w:p>
+    <w:p>
+      <w:pPr>
+        <w:spacing w:before="0" w:after="0" w:line="480" w:lineRule="auto"/>
+        <w:ind w:hanging="720" w:left="720"/>
+        <w:jc w:val="left"/>
+      </w:pPr>
+      <w:r>
+        <w:rPr>
+          <w:rFonts w:ascii="Times New Roman" w:hAnsi="Times New Roman" w:cs="Times New Roman" w:eastAsia="Times New Roman"/>
+          <w:color w:val="000000"/>
+          <w:sz w:val="24"/>
+        </w:rPr>
+        <w:t>Ministerio de Tecnologías de la Información y las Comunicaciones. (2018). Marco de referencia de arquitectura empresarial para la gestión de TI en el Estado colombiano. Gobierno de Colombia.</w:t>
+      </w:r>
+    </w:p>
+    <w:p>
+      <w:pPr>
+        <w:spacing w:before="0" w:after="0" w:line="480" w:lineRule="auto"/>
+        <w:ind w:hanging="720" w:left="720"/>
+        <w:jc w:val="left"/>
+      </w:pPr>
+      <w:r>
+        <w:rPr>
+          <w:rFonts w:ascii="Times New Roman" w:hAnsi="Times New Roman" w:cs="Times New Roman" w:eastAsia="Times New Roman"/>
+          <w:color w:val="000000"/>
+          <w:sz w:val="24"/>
+        </w:rPr>
+        <w:t>UGUR. (2009). Manuales de instalación de software [Material de formación]. Servicio Nacional de Aprendizaje.</w:t>
       </w:r>
     </w:p>
     <w:sectPr>

</xml_diff>